<commit_message>
Document how the images are acquired, before the pipeline touches them
The existing docs covered what the brain is and what the pipeline does to it,
but not where the images come from. acquisition.md works from nuclear spin
through to the BIDS sidecar in three depth tiers, with computed figures that
reproduce anywhere with numpy and matplotlib and involve no participant data.
</commit_message>
<xml_diff>
--- a/dwi_pipeline/brain.docx
+++ b/dwi_pipeline/brain.docx
@@ -176,6 +176,29 @@
     <w:p>
       <w:r>
         <w:t>Read the Foundation tier of every section first if you are new; the tiers are cumulative but each is self-contained enough to skip.</w:t>
+      </w:r>
+    </w:p>
+    <w:p>
+      <w:r>
+        <w:t xml:space="preserve">Its companion is </w:t>
+      </w:r>
+      <w:r>
+        <w:rPr>
+          <w:rFonts w:ascii="Courier New" w:hAnsi="Courier New"/>
+        </w:rPr>
+        <w:t>acquisition.md</w:t>
+      </w:r>
+      <w:r>
+        <w:t xml:space="preserve">, which covers where the images come from: the physics of the signal, how space is encoded, and why diffusion EPI arrives distorted. This document covers what is </w:t>
+      </w:r>
+      <w:r>
+        <w:rPr>
+          <w:i/>
+        </w:rPr>
+        <w:t>in</w:t>
+      </w:r>
+      <w:r>
+        <w:t xml:space="preserve"> the images.</w:t>
       </w:r>
     </w:p>
     <w:p>

</xml_diff>